<commit_message>
Added additional RFP items based on mining FIE's answer for discovery
</commit_message>
<xml_diff>
--- a/Filings/Discovery/FirstSetDiscovey/Request For Production/Plaintiffs_First_Set_of_Requests_for_Production_to_FIE.docx
+++ b/Filings/Discovery/FirstSetDiscovey/Request For Production/Plaintiffs_First_Set_of_Requests_for_Production_to_FIE.docx
@@ -1031,7 +1031,7 @@
         <w:t xml:space="preserve">REQUEST FOR PRODUCTION NO. 17:  </w:t>
       </w:r>
       <w:r>
-        <w:t>All documents in Your possession, custody, or control constituting or relating to the appraiser file of Greg Tomes, including his notes, photographs, measurements, methodology, drafts, invoices, and billing records; all communications between You and Mr. Tomes concerning The Claim or the appraisal, including all communications concerning the scope of the appraisal and the items to be evaluated; the agreement or engagement under which he was appointed; and all documents reflecting his reasons for not signing The Appraisal Award. If You contend any responsive document is not within Your possession, custody, or control, identify it and identify the person who has it. Plaintiffs contend that documents held by Greg Tomes in connection with his appointment as Your appraiser are within Your possession, custody, or control within the meaning of Minn. R. Civ. P. 34.01. If You disagree, state the basis for that position and produce the retention agreement, engagement letter, appointment documents, and any service or fee agreement governing Your access to those documents.</w:t>
+        <w:t>All documents in Your possession, custody, or control constituting or relating to the appraiser file of Greg Tomes, including his notes, photographs, measurements, methodology, drafts, invoices, and billing records; the report of Greg Tomes referred to in Your answer to paragraph 36 of the Complaint, the "appraiser’s position" on the windows that You forwarded to Plaintiff Lu on September 18, 2025, the "appraiser’s response" attached to Your September 19, 2025 letter, and every draft of each; all communications between You and Mr. Tomes concerning The Claim or the appraisal, including all communications concerning the scope of the appraisal and the items to be evaluated; the agreement or engagement under which he was appointed; and all documents reflecting his reasons for not signing The Appraisal Award. If You contend any responsive document is not within Your possession, custody, or control, identify it and identify the person who has it. Plaintiffs contend that documents held by Greg Tomes in connection with his appointment as Your appraiser are within Your possession, custody, or control within the meaning of Minn. R. Civ. P. 34.01. If You disagree, state the basis for that position and produce the retention agreement, engagement letter, appointment documents, and any service or fee agreement governing Your access to those documents.</w:t>
       </w:r>
     </w:p>
     <w:p>
@@ -1488,6 +1488,86 @@
       <w:r>
         <w:rPr/>
         <w:t>All documents concerning any inspection, estimate, valuation, or claim activity at The Property between January 1, 2021 and July 12, 2024, including the Building Loss Worksheet dated October 7, 2021 and the Farmers Insurance Letter and Estimate dated February 18, 2022, and including any claim number under which such activity was recorded.</w:t>
+      </w:r>
+    </w:p>
+    <w:p>
+      <w:pPr>
+        <w:spacing w:after="160" w:before="0" w:line="240" w:lineRule="auto"/>
+        <w:ind w:left="720" w:hanging="720"/>
+      </w:pPr>
+      <w:r>
+        <w:rPr>
+          <w:b/>
+        </w:rPr>
+        <w:t xml:space="preserve">REQUEST FOR PRODUCTION NO. 46:  </w:t>
+      </w:r>
+      <w:r>
+        <w:rPr/>
+        <w:t>All claim outcome correspondence, letters, or claim-system entries dated September 4, 2024 concerning The Claim. If no such document exists, state so expressly and identify the document You intended to refer to in Your answer to paragraph 53 of the Complaint.</w:t>
+      </w:r>
+    </w:p>
+    <w:p>
+      <w:pPr>
+        <w:spacing w:after="160" w:before="0" w:line="240" w:lineRule="auto"/>
+        <w:ind w:left="720" w:hanging="720"/>
+      </w:pPr>
+      <w:r>
+        <w:rPr>
+          <w:b/>
+        </w:rPr>
+        <w:t xml:space="preserve">REQUEST FOR PRODUCTION NO. 47:  </w:t>
+      </w:r>
+      <w:r>
+        <w:rPr/>
+        <w:t>All documents concerning any report by Plaintiffs of water intrusion, leaking, or active damage at The Property on or about October 28, 2025, including the communication itself, every claim-system entry recording its receipt, and every internal or external communication concerning it. If no such document exists, state so expressly.</w:t>
+      </w:r>
+    </w:p>
+    <w:p>
+      <w:pPr>
+        <w:spacing w:after="160" w:before="0" w:line="240" w:lineRule="auto"/>
+        <w:ind w:left="720" w:hanging="720"/>
+      </w:pPr>
+      <w:r>
+        <w:rPr>
+          <w:b/>
+        </w:rPr>
+        <w:t xml:space="preserve">REQUEST FOR PRODUCTION NO. 48:  </w:t>
+      </w:r>
+      <w:r>
+        <w:rPr/>
+        <w:t>Every communication from You to Plaintiffs, and every claim-system entry, sent or created after 11:59 p.m. on July 11, 2025 and on or before August 3, 2025, responding to or concerning Plaintiffs’ July 11, 2025 email about claim deadlines, together with all documents identifying its author and the date and manner of its transmission. If You contend that a communication sent on or before July 11, 2025 constitutes Your response to Plaintiffs’ July 11, 2025 email, identify that communication by date, time, author, and recipient. If no responsive communication exists, state so expressly.</w:t>
+      </w:r>
+    </w:p>
+    <w:p>
+      <w:pPr>
+        <w:spacing w:after="160" w:before="0" w:line="240" w:lineRule="auto"/>
+        <w:ind w:left="720" w:hanging="720"/>
+      </w:pPr>
+      <w:r>
+        <w:rPr>
+          <w:b/>
+        </w:rPr>
+        <w:t xml:space="preserve">REQUEST FOR PRODUCTION NO. 49:  </w:t>
+      </w:r>
+      <w:r>
+        <w:rPr/>
+        <w:t>All documents concerning any inspection, photograph, measurement, or evaluation, by You or by any person acting for You, of the window on the rear elevation of Plaintiffs’ attached garage located immediately south of the window depicted at photographs A-213 through A-217 of Photo Appendix A, at any time from October 22, 2014 through the present. If no such document exists, state so expressly.</w:t>
+      </w:r>
+    </w:p>
+    <w:p>
+      <w:pPr>
+        <w:spacing w:after="160" w:before="0" w:line="240" w:lineRule="auto"/>
+        <w:ind w:left="720" w:hanging="720"/>
+      </w:pPr>
+      <w:r>
+        <w:rPr>
+          <w:b/>
+        </w:rPr>
+        <w:t xml:space="preserve">REQUEST FOR PRODUCTION NO. 50:  </w:t>
+      </w:r>
+      <w:r>
+        <w:rPr/>
+        <w:t>All communications between any Farmers claim employee and Peter Pietila, any employee of his agency, or any other Farmers agent or agency, concerning The Claim, The 2020 Claim, The Policy, the appraisal, or The Appraisal Award, from July 13, 2024 through the present — including the October 14, 2025 email identified in Your answer to paragraph 36 of the Complaint — together with the complete agency file for The Policy.</w:t>
       </w:r>
     </w:p>
     <w:p>

</xml_diff>

<commit_message>
Additional analysis on interrogatories; get the first set of RFA
</commit_message>
<xml_diff>
--- a/Filings/Discovery/FirstSetDiscovey/Request For Production/Plaintiffs_First_Set_of_Requests_for_Production_to_FIE.docx
+++ b/Filings/Discovery/FirstSetDiscovey/Request For Production/Plaintiffs_First_Set_of_Requests_for_Production_to_FIE.docx
@@ -1844,6 +1844,18 @@
       </w:r>
       <w:r>
         <w:t>All communications between any Farmers claim employee and Peter Pietila, any employee of his agency, or any other Farmers agent or agency, concerning The Claim, The 2020 Claim, The Policy, the appraisal, or The Appraisal Award, from July 13, 2024 through the present — including the October 14, 2025 email identified in Your answer to paragraph 36 of the Complaint — together with the complete agency file for The Policy.</w:t>
+      </w:r>
+    </w:p>
+    <w:p>
+      <w:pPr>
+        <w:spacing w:after="160"/>
+        <w:ind w:left="720" w:hanging="576"/>
+      </w:pPr>
+      <w:r>
+        <w:rPr>
+          <w:b/>
+        </w:rPr>
+        <w:t>REQUEST FOR PRODUCTION NO. 51:  All documents describing, constituting, or governing the photograph-labeling convention used in the inspection application or software by which Hancock Claims Consultants documented the August 29, 2024 inspection of The Property, including any template, pick-list, drop-down menu, or predefined caption set from which captions in the form "Window Wrap North Damaged - No" and "Siding South Damage - No" were generated; any field guide, manual, instruction, or training material governing when an inspector selects or applies such a caption; and documents sufficient to show whether the numeric suffix appended to a repeated caption (for example, "- No_2" through "- No_20") is assigned automatically by the application or entered by the inspector. Plaintiffs contend that documents held by Hancock Claims Consultants in connection with its engagement by You are within Your possession, custody, or control within the meaning of Minn. R. Civ. P. 34.01. If You contend otherwise, state the basis for that position and identify the person who has the documents.</w:t>
       </w:r>
     </w:p>
     <w:p>

</xml_diff>

<commit_message>
Additional reviews on RFP, Interrogatories, and RFAs
</commit_message>
<xml_diff>
--- a/Filings/Discovery/FirstSetDiscovey/Request For Production/Plaintiffs_First_Set_of_Requests_for_Production_to_FIE.docx
+++ b/Filings/Discovery/FirstSetDiscovey/Request For Production/Plaintiffs_First_Set_of_Requests_for_Production_to_FIE.docx
@@ -1855,7 +1855,43 @@
         <w:rPr>
           <w:b/>
         </w:rPr>
-        <w:t>REQUEST FOR PRODUCTION NO. 51:  All documents describing, constituting, or governing the photograph-labeling convention used in the inspection application or software by which Hancock Claims Consultants documented the August 29, 2024 inspection of The Property, including any template, pick-list, drop-down menu, or predefined caption set from which captions in the form "Window Wrap North Damaged - No" and "Siding South Damage - No" were generated; any field guide, manual, instruction, or training material governing when an inspector selects or applies such a caption; and documents sufficient to show whether the numeric suffix appended to a repeated caption (for example, "- No_2" through "- No_20") is assigned automatically by the application or entered by the inspector. Plaintiffs contend that documents held by Hancock Claims Consultants in connection with its engagement by You are within Your possession, custody, or control within the meaning of Minn. R. Civ. P. 34.01. If You contend otherwise, state the basis for that position and identify the person who has the documents.</w:t>
+        <w:t xml:space="preserve">REQUEST FOR PRODUCTION NO. 51:  </w:t>
+      </w:r>
+      <w:r>
+        <w:rPr/>
+        <w:t>All documents describing, constituting, or governing the photograph-labeling convention used in the inspection application or software by which Hancock Claims Consultants documented the August 29, 2024 inspection of The Property, including any template, pick-list, drop-down menu, or predefined caption set from which captions in the form "Window Wrap North Damaged - No" and "Siding South Damage - No" were generated; any field guide, manual, instruction, or training material governing when an inspector selects or applies such a caption; and documents sufficient to show whether the numeric suffix appended to a repeated caption (for example, "- No_2" through "- No_20") is assigned automatically by the application or entered by the inspector. Plaintiffs contend that documents held by Hancock Claims Consultants in connection with its engagement by You are within Your possession, custody, or control within the meaning of Minn. R. Civ. P. 34.01. If You contend otherwise, state the basis for that position and identify the person who has the documents.</w:t>
+      </w:r>
+    </w:p>
+    <w:p>
+      <w:pPr>
+        <w:spacing w:after="160"/>
+        <w:ind w:left="720" w:hanging="576"/>
+      </w:pPr>
+      <w:r>
+        <w:rPr>
+          <w:b/>
+        </w:rPr>
+        <w:t xml:space="preserve">REQUEST FOR PRODUCTION NO. 52:  </w:t>
+      </w:r>
+      <w:r>
+        <w:rPr/>
+        <w:t>Documents sufficient to show, for each of Christian Dudley, Nicholas Brau, Bradlee Monson, Zorphlon Miller, Jillian Bell, and Peter Pietila, the legal entity that employed or engaged that person at the time of that person's involvement in The Claim or The Policy, including the entity named as employer or principal on any offer letter, assignment or staffing record, claim-system or portal user record, electronic mail signature block, business card, or license, appointment, or registration filing. This request does not seek compensation, performance, disciplinary, or benefits records.</w:t>
+      </w:r>
+    </w:p>
+    <w:p>
+      <w:pPr>
+        <w:spacing w:after="160"/>
+        <w:ind w:left="720" w:hanging="576"/>
+      </w:pPr>
+      <w:r>
+        <w:rPr>
+          <w:b/>
+        </w:rPr>
+        <w:t xml:space="preserve">REQUEST FOR PRODUCTION NO. 53:  </w:t>
+      </w:r>
+      <w:r>
+        <w:rPr/>
+        <w:t>Documents sufficient to show the legal name, form, and state of organization of the insurance agency through which Peter Pietila acted in connection with The Policy, together with the agency, producer, or appointment agreement under which that agency or Mr. Pietila was appointed by or contracted with Fire Insurance Exchange or any entity affiliated with Fire Insurance Exchange, and all amendments to it in force between October 22, 2014 and the present.</w:t>
       </w:r>
     </w:p>
     <w:p>

</xml_diff>

<commit_message>
Some definition review changes
</commit_message>
<xml_diff>
--- a/Filings/Discovery/FirstSetDiscovey/Request For Production/Plaintiffs_First_Set_of_Requests_for_Production_to_FIE.docx
+++ b/Filings/Discovery/FirstSetDiscovey/Request For Production/Plaintiffs_First_Set_of_Requests_for_Production_to_FIE.docx
@@ -366,15 +366,7 @@
         <w:t xml:space="preserve">“Photo Appendix A” </w:t>
       </w:r>
       <w:r>
-        <w:t xml:space="preserve">means the 110-page photographic appendix to The Prieve Report, titled “PHOTO APPENDIX A” and bearing File Number 241008 and site visit date October 9, 2024, containing photographs numbered A-1 through A-217, transmitted to Plaintiffs with Your November 4, </w:t>
-      </w:r>
-      <w:proofErr w:type="gramStart"/>
-      <w:r>
-        <w:t>2024</w:t>
-      </w:r>
-      <w:proofErr w:type="gramEnd"/>
-      <w:r>
-        <w:t xml:space="preserve"> letter.</w:t>
+        <w:t>means the 110-page photographic appendix to The Prieve Report, titled “PHOTO APPENDIX A” and bearing File Number 241008 and site visit date October 9, 2024, containing photographs numbered A-1 through A-217.</w:t>
       </w:r>
     </w:p>
     <w:p>
@@ -1858,7 +1850,6 @@
         <w:t xml:space="preserve">REQUEST FOR PRODUCTION NO. 51:  </w:t>
       </w:r>
       <w:r>
-        <w:rPr/>
         <w:t>All documents describing, constituting, or governing the photograph-labeling convention used in the inspection application or software by which Hancock Claims Consultants documented the August 29, 2024 inspection of The Property, including any template, pick-list, drop-down menu, or predefined caption set from which captions in the form "Window Wrap North Damaged - No" and "Siding South Damage - No" were generated; any field guide, manual, instruction, or training material governing when an inspector selects or applies such a caption; and documents sufficient to show whether the numeric suffix appended to a repeated caption (for example, "- No_2" through "- No_20") is assigned automatically by the application or entered by the inspector. Plaintiffs contend that documents held by Hancock Claims Consultants in connection with its engagement by You are within Your possession, custody, or control within the meaning of Minn. R. Civ. P. 34.01. If You contend otherwise, state the basis for that position and identify the person who has the documents.</w:t>
       </w:r>
     </w:p>
@@ -1874,7 +1865,6 @@
         <w:t xml:space="preserve">REQUEST FOR PRODUCTION NO. 52:  </w:t>
       </w:r>
       <w:r>
-        <w:rPr/>
         <w:t>Documents sufficient to show, for each of Christian Dudley, Nicholas Brau, Bradlee Monson, Zorphlon Miller, Jillian Bell, and Peter Pietila, the legal entity that employed or engaged that person at the time of that person's involvement in The Claim or The Policy, including the entity named as employer or principal on any offer letter, assignment or staffing record, claim-system or portal user record, electronic mail signature block, business card, or license, appointment, or registration filing. This request does not seek compensation, performance, disciplinary, or benefits records.</w:t>
       </w:r>
     </w:p>
@@ -1890,7 +1880,6 @@
         <w:t xml:space="preserve">REQUEST FOR PRODUCTION NO. 53:  </w:t>
       </w:r>
       <w:r>
-        <w:rPr/>
         <w:t>Documents sufficient to show the legal name, form, and state of organization of the insurance agency through which Peter Pietila acted in connection with The Policy, together with the agency, producer, or appointment agreement under which that agency or Mr. Pietila was appointed by or contracted with Fire Insurance Exchange or any entity affiliated with Fire Insurance Exchange, and all amendments to it in force between October 22, 2014 and the present.</w:t>
       </w:r>
     </w:p>
@@ -1905,7 +1894,17 @@
         <w:spacing w:before="240" w:after="160"/>
       </w:pPr>
       <w:r>
-        <w:t>Dated: ______________, 2026.</w:t>
+        <w:lastRenderedPageBreak/>
+        <w:t xml:space="preserve">Dated: </w:t>
+      </w:r>
+      <w:r>
+        <w:rPr>
+          <w:u w:val="single"/>
+        </w:rPr>
+        <w:t>September 15, 2026</w:t>
+      </w:r>
+      <w:r>
+        <w:t>.</w:t>
       </w:r>
     </w:p>
     <w:p>
@@ -2057,10 +2056,9 @@
         <w:ind w:left="720" w:hanging="576"/>
       </w:pPr>
       <w:r>
-        <w:rPr>
-          <w:i w:val="0"/>
-        </w:rPr>
         <w:t>1.</w:t>
+      </w:r>
+      <w:r>
         <w:tab/>
         <w:t>I am over the age of 18 years and a Plaintiff in this action. I personally made the service described below by electronic mail, in the manner the parties have agreed. Minn. R. Civ. P. 5.02(b); Minn. Gen. R. Prac. 14.03(d)(2).</w:t>
       </w:r>
@@ -2071,12 +2069,35 @@
         <w:ind w:left="720" w:hanging="576"/>
       </w:pPr>
       <w:r>
-        <w:rPr>
-          <w:i w:val="0"/>
-        </w:rPr>
         <w:t>2.</w:t>
+      </w:r>
+      <w:r>
         <w:tab/>
-        <w:t xml:space="preserve">On ______________, 2026, at ______ __.m. local Minnesota time, I served a true and correct copy of </w:t>
+        <w:t xml:space="preserve">On </w:t>
+      </w:r>
+      <w:r>
+        <w:rPr>
+          <w:u w:val="single"/>
+        </w:rPr>
+        <w:t>September 15, 2026</w:t>
+      </w:r>
+      <w:r>
+        <w:t xml:space="preserve">, at ______ </w:t>
+      </w:r>
+      <w:r>
+        <w:rPr>
+          <w:u w:val="single"/>
+        </w:rPr>
+        <w:t>p</w:t>
+      </w:r>
+      <w:r>
+        <w:rPr>
+          <w:u w:val="single"/>
+        </w:rPr>
+        <w:t>.m</w:t>
+      </w:r>
+      <w:r>
+        <w:t xml:space="preserve">. local Minnesota time, I served a true and correct copy of </w:t>
       </w:r>
       <w:r>
         <w:rPr>
@@ -2085,9 +2106,6 @@
         <w:t>Plaintiffs’ First Set of Requests for Production of Documents to Defendant Fire Insurance Exchange</w:t>
       </w:r>
       <w:r>
-        <w:rPr>
-          <w:i w:val="0"/>
-        </w:rPr>
         <w:t xml:space="preserve"> upon Defendant's counsel of record by transmitting it as a PDF attachment to an electronic mail message addressed as follows:</w:t>
       </w:r>
     </w:p>
@@ -2097,9 +2115,6 @@
         <w:ind w:left="1080"/>
       </w:pPr>
       <w:r>
-        <w:rPr>
-          <w:i w:val="0"/>
-        </w:rPr>
         <w:t>Kevin J. Kennedy (#193872) — kkennedy@kennedylf.com</w:t>
       </w:r>
     </w:p>
@@ -2109,9 +2124,6 @@
         <w:ind w:left="1080"/>
       </w:pPr>
       <w:r>
-        <w:rPr>
-          <w:i w:val="0"/>
-        </w:rPr>
         <w:t>Mary J. Baskfield (#0314572) — mbaskfield@kennedylf.com</w:t>
       </w:r>
     </w:p>
@@ -2160,10 +2172,9 @@
         <w:ind w:left="720" w:hanging="576"/>
       </w:pPr>
       <w:r>
-        <w:rPr>
-          <w:i w:val="0"/>
-        </w:rPr>
         <w:t>3.</w:t>
+      </w:r>
+      <w:r>
         <w:tab/>
         <w:t>The transmission was sent from bill_y_lu@yahoo.com. I did not receive any indication that the transmission failed or was undeliverable. I have retained a copy of the transmission.</w:t>
       </w:r>
@@ -2174,10 +2185,9 @@
         <w:ind w:left="720" w:hanging="576"/>
       </w:pPr>
       <w:r>
-        <w:rPr>
-          <w:i w:val="0"/>
-        </w:rPr>
         <w:t>4.</w:t>
+      </w:r>
+      <w:r>
         <w:tab/>
         <w:t>These discovery requests are served, not filed, in accordance with Minn. R. Civ. P. 5.04(b).</w:t>
       </w:r>
@@ -2195,7 +2205,16 @@
         <w:spacing w:after="160" w:line="276" w:lineRule="auto"/>
       </w:pPr>
       <w:r>
-        <w:t>Dated: ______________, 2026, at Eden Prairie, Hennepin County, Minnesota.</w:t>
+        <w:t xml:space="preserve">Dated: </w:t>
+      </w:r>
+      <w:r>
+        <w:rPr>
+          <w:u w:val="single"/>
+        </w:rPr>
+        <w:t>September 15, 2026</w:t>
+      </w:r>
+      <w:r>
+        <w:t>, at Eden Prairie, Hennepin County, Minnesota.</w:t>
       </w:r>
     </w:p>
     <w:p>
@@ -2220,18 +2239,14 @@
     <w:p>
       <w:pPr>
         <w:tabs>
-          <w:tab w:pos="2016" w:val="left"/>
+          <w:tab w:val="left" w:pos="2016"/>
         </w:tabs>
-        <w:spacing w:after="0" w:line="276" w:lineRule="auto"/>
-      </w:pPr>
-      <w:proofErr w:type="spellStart"/>
-      <w:proofErr w:type="spellEnd"/>
-      <w:r>
-        <w:rPr>
-          <w:b w:val="0"/>
-          <w:i w:val="0"/>
-        </w:rPr>
+        <w:spacing w:line="276" w:lineRule="auto"/>
+      </w:pPr>
+      <w:r>
         <w:t>Name:</w:t>
+      </w:r>
+      <w:r>
         <w:tab/>
         <w:t>Yibiao Lu</w:t>
       </w:r>
@@ -2239,18 +2254,14 @@
     <w:p>
       <w:pPr>
         <w:tabs>
-          <w:tab w:pos="2016" w:val="left"/>
+          <w:tab w:val="left" w:pos="2016"/>
         </w:tabs>
-        <w:spacing w:after="0" w:line="276" w:lineRule="auto"/>
-      </w:pPr>
-      <w:proofErr w:type="spellStart"/>
-      <w:proofErr w:type="spellEnd"/>
-      <w:r>
-        <w:rPr>
-          <w:b w:val="0"/>
-          <w:i w:val="0"/>
-        </w:rPr>
+        <w:spacing w:line="276" w:lineRule="auto"/>
+      </w:pPr>
+      <w:r>
         <w:t>Address:</w:t>
+      </w:r>
+      <w:r>
         <w:tab/>
         <w:t>17756 George Moran Dr.</w:t>
       </w:r>
@@ -2258,18 +2269,14 @@
     <w:p>
       <w:pPr>
         <w:tabs>
-          <w:tab w:pos="2016" w:val="left"/>
+          <w:tab w:val="left" w:pos="2016"/>
         </w:tabs>
-        <w:spacing w:after="0" w:line="276" w:lineRule="auto"/>
-      </w:pPr>
-      <w:proofErr w:type="spellStart"/>
-      <w:proofErr w:type="spellEnd"/>
-      <w:r>
-        <w:rPr>
-          <w:b w:val="0"/>
-          <w:i w:val="0"/>
-        </w:rPr>
+        <w:spacing w:line="276" w:lineRule="auto"/>
+      </w:pPr>
+      <w:r>
         <w:t>City/State/Zip:</w:t>
+      </w:r>
+      <w:r>
         <w:tab/>
         <w:t>Eden Prairie, MN 55347</w:t>
       </w:r>
@@ -2277,18 +2284,14 @@
     <w:p>
       <w:pPr>
         <w:tabs>
-          <w:tab w:pos="2016" w:val="left"/>
+          <w:tab w:val="left" w:pos="2016"/>
         </w:tabs>
-        <w:spacing w:after="0" w:line="276" w:lineRule="auto"/>
-      </w:pPr>
-      <w:proofErr w:type="spellStart"/>
-      <w:proofErr w:type="spellEnd"/>
-      <w:r>
-        <w:rPr>
-          <w:b w:val="0"/>
-          <w:i w:val="0"/>
-        </w:rPr>
+        <w:spacing w:line="276" w:lineRule="auto"/>
+      </w:pPr>
+      <w:r>
         <w:t>Telephone:</w:t>
+      </w:r>
+      <w:r>
         <w:tab/>
         <w:t>763-843-2859</w:t>
       </w:r>
@@ -2296,18 +2299,14 @@
     <w:p>
       <w:pPr>
         <w:tabs>
-          <w:tab w:pos="2016" w:val="left"/>
+          <w:tab w:val="left" w:pos="2016"/>
         </w:tabs>
         <w:spacing w:after="160" w:line="276" w:lineRule="auto"/>
       </w:pPr>
-      <w:proofErr w:type="spellStart"/>
-      <w:proofErr w:type="spellEnd"/>
-      <w:r>
-        <w:rPr>
-          <w:b w:val="0"/>
-          <w:i w:val="0"/>
-        </w:rPr>
+      <w:r>
         <w:t>E-mail address:</w:t>
+      </w:r>
+      <w:r>
         <w:tab/>
         <w:t>bill_y_lu@yahoo.com</w:t>
       </w:r>

</xml_diff>